<commit_message>
Carl Tasks, Extra Tasks
</commit_message>
<xml_diff>
--- a/ReportsLayout/JobCertificationLayout.docx
+++ b/ReportsLayout/JobCertificationLayout.docx
@@ -3164,7 +3164,9 @@
 </a:theme>
 </file>
 
-<file path=customXml/item1.xml>��< ? x m l   v e r s i o n = " 1 . 0 "   e n c o d i n g = " u t f - 1 6 " ? > < N a v W o r d R e p o r t X m l P a r t   x m l n s = " u r n : m i c r o s o f t - d y n a m i c s - n a v / r e p o r t s / J o b C e r t i f i c a t i o n / 8 0 6 3 3 / " > +<file path=customXml/item1.xml>��< ? x m l   v e r s i o n = " 1 . 0 "   e n c o d i n g = " u t f - 1 6 " ? > + 
+ < N a v W o r d R e p o r t X m l P a r t   x m l n s = " u r n : m i c r o s o f t - d y n a m i c s - n a v / r e p o r t s / J o b C e r t i f i c a t i o n / 8 0 6 3 3 / " >   
      < B C R e p o r t I n f o r m a t i o n >   
@@ -3262,7 +3264,7 @@
  
          < L a s t N a m e > L a s t N a m e < / L a s t N a m e >   
-         < L o g o P i c t u r e > L o g o P i c t u r e < / L o g o P i c t u r e > +         < L o g o P i c t u r e   / >   
      < / E m p l o y e e I n f o >   

</xml_diff>